<commit_message>
updated CV for ATS friendliness
</commit_message>
<xml_diff>
--- a/public/documents/cv_nipuna_c_gomes.docx
+++ b/public/documents/cv_nipuna_c_gomes.docx
@@ -11,36 +11,33 @@
           <w:rStyle w:val="Heading1Char"/>
           <w:sz w:val="52"/>
         </w:rPr>
-        <w:t xml:space="preserve">D.K.C </w:t>
+        <w:t>NIPUNA GOMES</w:t>
+      </w:r>
+      <w:r>
+        <w:br/>
       </w:r>
       <w:r>
         <w:rPr>
           <w:rStyle w:val="Heading1Char"/>
-          <w:sz w:val="52"/>
-        </w:rPr>
-        <w:t>NIPUNA GOMES</w:t>
-      </w:r>
-      <w:r>
-        <w:br/>
+        </w:rPr>
+        <w:t>TECH LEAD</w:t>
       </w:r>
       <w:r>
         <w:rPr>
           <w:rStyle w:val="Heading1Char"/>
         </w:rPr>
-        <w:t>TECH LEAD</w:t>
-      </w:r>
-      <w:r>
-        <w:rPr>
-          <w:rStyle w:val="Heading1Char"/>
-        </w:rPr>
         <w:t xml:space="preserve"> </w:t>
       </w:r>
-      <w:bookmarkStart w:id="0" w:name="_GoBack"/>
-      <w:bookmarkEnd w:id="0"/>
     </w:p>
     <w:p>
-      <w:r>
-        <w:t xml:space="preserve">Colombo, Sri Lanka | </w:t>
+      <w:pPr>
+        <w:jc w:val="both"/>
+      </w:pPr>
+      <w:r>
+        <w:t>Colombo, SL (UTC+5.30) | Open to Remote</w:t>
+      </w:r>
+      <w:r>
+        <w:t xml:space="preserve"> | </w:t>
       </w:r>
       <w:r>
         <w:t>dkcnipunagomes@gmail.com</w:t>
@@ -61,39 +58,29 @@
         <w:t>22 777</w:t>
       </w:r>
       <w:r>
-        <w:t xml:space="preserve"> | </w:t>
+        <w:t xml:space="preserve"> </w:t>
+      </w:r>
+      <w:r>
+        <w:br/>
+      </w:r>
+      <w:r>
+        <w:br/>
       </w:r>
       <w:hyperlink r:id="rId6" w:history="1">
         <w:r>
           <w:rPr>
             <w:rStyle w:val="Hyperlink"/>
           </w:rPr>
-          <w:t>linkedin.com/i</w:t>
+          <w:t>linkedin.com/in/</w:t>
         </w:r>
+        <w:proofErr w:type="spellStart"/>
         <w:r>
           <w:rPr>
             <w:rStyle w:val="Hyperlink"/>
           </w:rPr>
-          <w:t>n</w:t>
+          <w:t>nipuna-gomes</w:t>
         </w:r>
-        <w:r>
-          <w:rPr>
-            <w:rStyle w:val="Hyperlink"/>
-          </w:rPr>
-          <w:t>/n</w:t>
-        </w:r>
-        <w:r>
-          <w:rPr>
-            <w:rStyle w:val="Hyperlink"/>
-          </w:rPr>
-          <w:t>i</w:t>
-        </w:r>
-        <w:r>
-          <w:rPr>
-            <w:rStyle w:val="Hyperlink"/>
-          </w:rPr>
-          <w:t>puna-gomes</w:t>
-        </w:r>
+        <w:proofErr w:type="spellEnd"/>
       </w:hyperlink>
     </w:p>
     <w:p>
@@ -129,8 +116,9 @@
           <w:sz w:val="22"/>
           <w:szCs w:val="22"/>
         </w:rPr>
-        <w:t>High-impact Technical Lead with over 1</w:t>
-      </w:r>
+        <w:t xml:space="preserve">Technical Lead with over 10 years of experience delivering scalable, fault-tolerant enterprise solutions in Fintech and </w:t>
+      </w:r>
+      <w:proofErr w:type="spellStart"/>
       <w:r>
         <w:rPr>
           <w:rFonts w:asciiTheme="minorHAnsi" w:eastAsiaTheme="minorEastAsia" w:hAnsiTheme="minorHAnsi" w:cstheme="minorBidi"/>
@@ -140,8 +128,9 @@
           <w:sz w:val="22"/>
           <w:szCs w:val="22"/>
         </w:rPr>
-        <w:t>0</w:t>
-      </w:r>
+        <w:t>eCommerce</w:t>
+      </w:r>
+      <w:proofErr w:type="spellEnd"/>
       <w:r>
         <w:rPr>
           <w:rFonts w:asciiTheme="minorHAnsi" w:eastAsiaTheme="minorEastAsia" w:hAnsiTheme="minorHAnsi" w:cstheme="minorBidi"/>
@@ -151,9 +140,8 @@
           <w:sz w:val="22"/>
           <w:szCs w:val="22"/>
         </w:rPr>
-        <w:t xml:space="preserve"> years of experience delivering scalable, fault-tolerant enterprise solutions in Fintech and eCommerce. Expert in driving architectural evolution—migrating legacy monoliths to high-performance </w:t>
-      </w:r>
-      <w:proofErr w:type="spellStart"/>
+        <w:t xml:space="preserve">. AWS Certified Solutions Architect (Associate) with a proven track record in establishing rigorous technical standards and optimizing system performance.  </w:t>
+      </w:r>
       <w:r>
         <w:rPr>
           <w:rFonts w:asciiTheme="minorHAnsi" w:eastAsiaTheme="minorEastAsia" w:hAnsiTheme="minorHAnsi" w:cstheme="minorBidi"/>
@@ -163,145 +151,77 @@
           <w:sz w:val="22"/>
           <w:szCs w:val="22"/>
         </w:rPr>
-        <w:t>Microservices</w:t>
-      </w:r>
-      <w:proofErr w:type="spellEnd"/>
-      <w:r>
-        <w:rPr>
-          <w:rFonts w:asciiTheme="minorHAnsi" w:eastAsiaTheme="minorEastAsia" w:hAnsiTheme="minorHAnsi" w:cstheme="minorBidi"/>
-          <w:b w:val="0"/>
-          <w:bCs w:val="0"/>
-          <w:color w:val="auto"/>
-          <w:sz w:val="22"/>
-          <w:szCs w:val="22"/>
-        </w:rPr>
-        <w:t xml:space="preserve"> utilizing Clean Architecture, CQRS, and </w:t>
-      </w:r>
-      <w:proofErr w:type="spellStart"/>
-      <w:r>
-        <w:rPr>
-          <w:rFonts w:asciiTheme="minorHAnsi" w:eastAsiaTheme="minorEastAsia" w:hAnsiTheme="minorHAnsi" w:cstheme="minorBidi"/>
-          <w:b w:val="0"/>
-          <w:bCs w:val="0"/>
-          <w:color w:val="auto"/>
-          <w:sz w:val="22"/>
-          <w:szCs w:val="22"/>
-        </w:rPr>
-        <w:t>Redis</w:t>
-      </w:r>
-      <w:proofErr w:type="spellEnd"/>
-      <w:r>
-        <w:rPr>
-          <w:rFonts w:asciiTheme="minorHAnsi" w:eastAsiaTheme="minorEastAsia" w:hAnsiTheme="minorHAnsi" w:cstheme="minorBidi"/>
-          <w:b w:val="0"/>
-          <w:bCs w:val="0"/>
-          <w:color w:val="auto"/>
-          <w:sz w:val="22"/>
-          <w:szCs w:val="22"/>
-        </w:rPr>
-        <w:t xml:space="preserve"> caching.</w:t>
+        <w:br/>
       </w:r>
     </w:p>
     <w:p>
       <w:pPr>
-        <w:pStyle w:val="Heading1"/>
-        <w:rPr>
-          <w:rFonts w:asciiTheme="minorHAnsi" w:eastAsiaTheme="minorEastAsia" w:hAnsiTheme="minorHAnsi" w:cstheme="minorBidi"/>
-          <w:b w:val="0"/>
-          <w:bCs w:val="0"/>
-          <w:color w:val="auto"/>
-          <w:sz w:val="22"/>
-          <w:szCs w:val="22"/>
-        </w:rPr>
-      </w:pPr>
-      <w:r>
-        <w:rPr>
-          <w:rFonts w:asciiTheme="minorHAnsi" w:eastAsiaTheme="minorEastAsia" w:hAnsiTheme="minorHAnsi" w:cstheme="minorBidi"/>
-          <w:b w:val="0"/>
-          <w:bCs w:val="0"/>
-          <w:color w:val="auto"/>
-          <w:sz w:val="22"/>
-          <w:szCs w:val="22"/>
-        </w:rPr>
-        <w:t>A hands-on leader who bridges the gap between engineering and product goals. AWS Certified Solutions Architect (</w:t>
-      </w:r>
-      <w:r>
-        <w:rPr>
-          <w:rFonts w:asciiTheme="minorHAnsi" w:eastAsiaTheme="minorEastAsia" w:hAnsiTheme="minorHAnsi" w:cstheme="minorBidi"/>
-          <w:b w:val="0"/>
-          <w:bCs w:val="0"/>
-          <w:color w:val="auto"/>
-          <w:sz w:val="22"/>
-          <w:szCs w:val="22"/>
-        </w:rPr>
-        <w:t>Associate) with p</w:t>
-      </w:r>
-      <w:r>
-        <w:rPr>
-          <w:rFonts w:asciiTheme="minorHAnsi" w:eastAsiaTheme="minorEastAsia" w:hAnsiTheme="minorHAnsi" w:cstheme="minorBidi"/>
-          <w:b w:val="0"/>
-          <w:bCs w:val="0"/>
-          <w:color w:val="auto"/>
-          <w:sz w:val="22"/>
-          <w:szCs w:val="22"/>
-        </w:rPr>
-        <w:t>roven track record in establishing rigorous technical standards, optimizing 99.9% system uptime, and improving code maintainability by 60%. I specialize in scaling engineering culture through technical mentorship, high-level resource planning, and data-driven Agile delivery, maintaining an 80% success rate in developer performance coaching.</w:t>
+        <w:pStyle w:val="ListParagraph"/>
+        <w:numPr>
+          <w:ilvl w:val="0"/>
+          <w:numId w:val="12"/>
+        </w:numPr>
+      </w:pPr>
+      <w:r>
+        <w:t xml:space="preserve">Architectural Evolution: Expert in migrating legacy monoliths to high-performance </w:t>
+      </w:r>
+      <w:proofErr w:type="spellStart"/>
+      <w:r>
+        <w:t>Microservices</w:t>
+      </w:r>
+      <w:proofErr w:type="spellEnd"/>
+      <w:r>
+        <w:t xml:space="preserve"> using Clean Architecture, CQRS, and Event-Driven patterns</w:t>
+      </w:r>
+      <w:r>
+        <w:br/>
       </w:r>
     </w:p>
     <w:p>
       <w:pPr>
-        <w:pStyle w:val="Heading1"/>
-        <w:rPr>
-          <w:caps/>
-        </w:rPr>
-      </w:pPr>
-      <w:r>
-        <w:rPr>
-          <w:caps/>
-        </w:rPr>
-        <w:t>Technical Skills</w:t>
-      </w:r>
-      <w:r>
-        <w:rPr>
-          <w:caps/>
-        </w:rPr>
+        <w:pStyle w:val="ListParagraph"/>
+        <w:numPr>
+          <w:ilvl w:val="0"/>
+          <w:numId w:val="12"/>
+        </w:numPr>
+      </w:pPr>
+      <w:r>
+        <w:t>Operational Excellence: Demonstrated success in maintaining 99.9% system uptime and improving code maintainability by 60% through automated testing and CI/CD optimization.</w:t>
+      </w:r>
+      <w:r>
         <w:br/>
       </w:r>
     </w:p>
     <w:p>
       <w:pPr>
-        <w:pStyle w:val="ListBullet"/>
-      </w:pPr>
-      <w:r>
-        <w:rPr>
-          <w:b/>
-        </w:rPr>
-        <w:t xml:space="preserve">Architecture: </w:t>
-      </w:r>
-      <w:proofErr w:type="spellStart"/>
-      <w:r>
-        <w:t>Microservices</w:t>
-      </w:r>
-      <w:proofErr w:type="spellEnd"/>
-      <w:r>
-        <w:t>, RESTful APIs, Event-Driven Architecture</w:t>
+        <w:pStyle w:val="ListParagraph"/>
+        <w:numPr>
+          <w:ilvl w:val="0"/>
+          <w:numId w:val="12"/>
+        </w:numPr>
+      </w:pPr>
+      <w:r>
+        <w:t>Engineering Leadership: Specialized in scaling culture via technical mentorship and structured peer-review systems, achieving an 80% success rate in developer performance coaching.</w:t>
       </w:r>
     </w:p>
     <w:p>
       <w:pPr>
-        <w:pStyle w:val="ListBullet"/>
-      </w:pPr>
-      <w:r>
-        <w:rPr>
-          <w:b/>
-        </w:rPr>
-        <w:t xml:space="preserve">Languages: </w:t>
-      </w:r>
-      <w:r>
-        <w:t>C#</w:t>
-      </w:r>
-      <w:r>
-        <w:t>, JavaScript, SQL, HTML5, CSS3</w:t>
+        <w:pStyle w:val="Heading1"/>
+        <w:rPr>
+          <w:caps/>
+        </w:rPr>
+      </w:pPr>
+      <w:r>
+        <w:rPr>
+          <w:caps/>
+        </w:rPr>
+        <w:t>Technical Skills</w:t>
+      </w:r>
+      <w:r>
+        <w:rPr>
+          <w:caps/>
+        </w:rPr>
+        <w:br/>
       </w:r>
     </w:p>
     <w:p>
@@ -312,13 +232,24 @@
         <w:rPr>
           <w:b/>
         </w:rPr>
-        <w:t xml:space="preserve">Frameworks: </w:t>
-      </w:r>
-      <w:r>
-        <w:t>Next.js</w:t>
-      </w:r>
-      <w:r>
-        <w:t>, React, Node.js</w:t>
+        <w:t xml:space="preserve">Architecture: </w:t>
+      </w:r>
+      <w:proofErr w:type="spellStart"/>
+      <w:r>
+        <w:t>Microservices</w:t>
+      </w:r>
+      <w:proofErr w:type="spellEnd"/>
+      <w:r>
+        <w:t>, RESTful APIs, Event-Driven Architecture</w:t>
+      </w:r>
+      <w:r>
+        <w:t>,</w:t>
+      </w:r>
+      <w:r>
+        <w:t xml:space="preserve"> </w:t>
+      </w:r>
+      <w:r>
+        <w:t>CQRS and Clean Architecture</w:t>
       </w:r>
     </w:p>
     <w:p>
@@ -329,18 +260,13 @@
         <w:rPr>
           <w:b/>
         </w:rPr>
-        <w:t xml:space="preserve">Cloud &amp; DevOps: </w:t>
-      </w:r>
-      <w:r>
-        <w:t xml:space="preserve">AWS (EC2, S3, Lambda), Docker, Jenkins, </w:t>
-      </w:r>
-      <w:proofErr w:type="spellStart"/>
-      <w:r>
-        <w:t>Git</w:t>
-      </w:r>
-      <w:proofErr w:type="spellEnd"/>
-      <w:r>
-        <w:t>, Terraform</w:t>
+        <w:t xml:space="preserve">Languages: </w:t>
+      </w:r>
+      <w:r>
+        <w:t>C#</w:t>
+      </w:r>
+      <w:r>
+        <w:t>, JavaScript, SQL, HTML5, CSS3</w:t>
       </w:r>
     </w:p>
     <w:p>
@@ -351,37 +277,108 @@
         <w:rPr>
           <w:b/>
         </w:rPr>
-        <w:t xml:space="preserve">Databases: </w:t>
-      </w:r>
-      <w:r>
-        <w:t xml:space="preserve">MySQL, </w:t>
-      </w:r>
-      <w:r>
-        <w:t>MS SQL</w:t>
+        <w:t xml:space="preserve">Frameworks: </w:t>
+      </w:r>
+      <w:r>
+        <w:t>Next.js</w:t>
+      </w:r>
+      <w:r>
+        <w:t xml:space="preserve">, React, </w:t>
+      </w:r>
+      <w:r>
+        <w:t xml:space="preserve">Node.js, </w:t>
+      </w:r>
+      <w:proofErr w:type="gramStart"/>
+      <w:r>
+        <w:t>Vite</w:t>
+      </w:r>
+      <w:r>
+        <w:t xml:space="preserve"> ,</w:t>
+      </w:r>
+      <w:proofErr w:type="gramEnd"/>
+      <w:r>
+        <w:t xml:space="preserve"> </w:t>
+      </w:r>
+      <w:r>
+        <w:t>TypeScript</w:t>
       </w:r>
     </w:p>
     <w:p>
       <w:pPr>
-        <w:pStyle w:val="Heading1"/>
-        <w:rPr>
-          <w:caps/>
-        </w:rPr>
-      </w:pPr>
-      <w:r>
-        <w:rPr>
-          <w:caps/>
-        </w:rPr>
-        <w:t>Professional Experience</w:t>
-      </w:r>
-      <w:r>
-        <w:rPr>
-          <w:caps/>
-        </w:rPr>
-        <w:br/>
+        <w:pStyle w:val="ListBullet"/>
+      </w:pPr>
+      <w:r>
+        <w:rPr>
+          <w:b/>
+        </w:rPr>
+        <w:t xml:space="preserve">Cloud &amp; DevOps: </w:t>
+      </w:r>
+      <w:r>
+        <w:t>AWS (EC2, S3, Lambda</w:t>
+      </w:r>
+      <w:r>
+        <w:t>, VPC, IAM</w:t>
+      </w:r>
+      <w:r>
+        <w:t xml:space="preserve">), Docker, Jenkins, </w:t>
+      </w:r>
+      <w:proofErr w:type="spellStart"/>
+      <w:r>
+        <w:t>Git</w:t>
+      </w:r>
+      <w:proofErr w:type="spellEnd"/>
+      <w:r>
+        <w:t>, Terraform</w:t>
       </w:r>
     </w:p>
     <w:p>
       <w:pPr>
+        <w:pStyle w:val="ListBullet"/>
+      </w:pPr>
+      <w:r>
+        <w:rPr>
+          <w:b/>
+        </w:rPr>
+        <w:t xml:space="preserve">Databases: </w:t>
+      </w:r>
+      <w:r>
+        <w:t xml:space="preserve">MySQL, </w:t>
+      </w:r>
+      <w:r>
+        <w:t>MS SQL</w:t>
+      </w:r>
+    </w:p>
+    <w:p>
+      <w:pPr>
+        <w:pStyle w:val="ListBullet"/>
+        <w:rPr>
+          <w:caps/>
+        </w:rPr>
+      </w:pPr>
+      <w:r>
+        <w:t>AI &amp; Modern Tools:</w:t>
+      </w:r>
+      <w:r>
+        <w:t xml:space="preserve"> Prompt Engineering, Agentic Coordination</w:t>
+      </w:r>
+      <w:r>
+        <w:br/>
+      </w:r>
+      <w:r>
+        <w:rPr>
+          <w:caps/>
+        </w:rPr>
+        <w:t>Professional Experience</w:t>
+      </w:r>
+      <w:r>
+        <w:rPr>
+          <w:caps/>
+        </w:rPr>
+        <w:br/>
+      </w:r>
+    </w:p>
+    <w:p>
+      <w:pPr>
         <w:rPr>
           <w:sz w:val="20"/>
         </w:rPr>
@@ -396,65 +393,82 @@
         <w:rPr>
           <w:b/>
         </w:rPr>
-        <w:t>- Autoavans Technology (</w:t>
-      </w:r>
-      <w:proofErr w:type="gramStart"/>
+        <w:t xml:space="preserve">- </w:t>
+      </w:r>
+      <w:proofErr w:type="spellStart"/>
       <w:r>
         <w:rPr>
           <w:b/>
         </w:rPr>
-        <w:t>Pvt )</w:t>
-      </w:r>
-      <w:proofErr w:type="gramEnd"/>
+        <w:t>Autoavans</w:t>
+      </w:r>
+      <w:proofErr w:type="spellEnd"/>
       <w:r>
         <w:rPr>
           <w:b/>
         </w:rPr>
-        <w:t xml:space="preserve"> Ltd. (</w:t>
-      </w:r>
-      <w:r>
-        <w:rPr>
-          <w:b/>
-        </w:rPr>
-        <w:t>Sweden</w:t>
-      </w:r>
-      <w:r>
-        <w:rPr>
-          <w:b/>
-        </w:rPr>
-        <w:t>)</w:t>
-      </w:r>
-      <w:r>
-        <w:rPr>
-          <w:b/>
-        </w:rPr>
-        <w:tab/>
+        <w:t xml:space="preserve"> Technology </w:t>
       </w:r>
       <w:r>
         <w:rPr>
           <w:b/>
           <w:sz w:val="20"/>
         </w:rPr>
-        <w:tab/>
+        <w:t>(Sweden</w:t>
       </w:r>
       <w:r>
         <w:rPr>
           <w:b/>
           <w:sz w:val="20"/>
         </w:rPr>
-        <w:t xml:space="preserve"> </w:t>
-      </w:r>
-      <w:r>
-        <w:rPr>
-          <w:sz w:val="20"/>
-        </w:rPr>
-        <w:t>Aug</w:t>
+        <w:t xml:space="preserve"> based Business Operations</w:t>
       </w:r>
       <w:r>
         <w:rPr>
           <w:b/>
           <w:sz w:val="20"/>
         </w:rPr>
+        <w:t>)</w:t>
+      </w:r>
+      <w:r>
+        <w:rPr>
+          <w:b/>
+        </w:rPr>
+        <w:tab/>
+      </w:r>
+      <w:r>
+        <w:rPr>
+          <w:b/>
+          <w:sz w:val="20"/>
+        </w:rPr>
+        <w:tab/>
+      </w:r>
+      <w:r>
+        <w:rPr>
+          <w:b/>
+          <w:sz w:val="20"/>
+        </w:rPr>
+        <w:tab/>
+      </w:r>
+      <w:r>
+        <w:rPr>
+          <w:b/>
+          <w:sz w:val="20"/>
+        </w:rPr>
+        <w:tab/>
+      </w:r>
+      <w:r>
+        <w:rPr>
+          <w:b/>
+          <w:sz w:val="20"/>
+        </w:rPr>
+        <w:tab/>
+      </w:r>
+      <w:r>
+        <w:rPr>
+          <w:b/>
+          <w:sz w:val="20"/>
+        </w:rPr>
         <w:t xml:space="preserve"> </w:t>
       </w:r>
       <w:r>
@@ -462,14 +476,21 @@
           <w:i/>
           <w:sz w:val="20"/>
         </w:rPr>
-        <w:t xml:space="preserve">2019 – </w:t>
+        <w:t>July</w:t>
       </w:r>
       <w:r>
         <w:rPr>
           <w:i/>
           <w:sz w:val="20"/>
         </w:rPr>
-        <w:t>Jan 2023 |  July 2024 - present</w:t>
+        <w:t xml:space="preserve"> 2025</w:t>
+      </w:r>
+      <w:r>
+        <w:rPr>
+          <w:i/>
+          <w:sz w:val="20"/>
+        </w:rPr>
+        <w:t xml:space="preserve"> - present</w:t>
       </w:r>
     </w:p>
     <w:p>
@@ -490,7 +511,7 @@
         <w:t xml:space="preserve">Lead a cross-functional team of </w:t>
       </w:r>
       <w:r>
-        <w:t>3</w:t>
+        <w:t>4</w:t>
       </w:r>
       <w:r>
         <w:t xml:space="preserve"> </w:t>
@@ -499,7 +520,13 @@
         <w:t>engineers to</w:t>
       </w:r>
       <w:r>
-        <w:t xml:space="preserve"> build and scale a high-traffic financial transaction platform handling 1M+ daily requests.</w:t>
+        <w:t xml:space="preserve"> build and scale a high-traffic financial transaction</w:t>
+      </w:r>
+      <w:r>
+        <w:t>.</w:t>
+      </w:r>
+      <w:r>
+        <w:t xml:space="preserve"> platform handling 1M+ daily requests.</w:t>
       </w:r>
     </w:p>
     <w:p>
@@ -510,22 +537,18 @@
         </w:tabs>
       </w:pPr>
       <w:r>
-        <w:t xml:space="preserve">Responsible for </w:t>
-      </w:r>
-      <w:r>
-        <w:t xml:space="preserve">Prod / Stg / Dev </w:t>
-      </w:r>
-      <w:r>
-        <w:t xml:space="preserve">deployment management </w:t>
-      </w:r>
-      <w:r>
-        <w:t>using CI/CD pipelines and GIT Lab</w:t>
-      </w:r>
-      <w:r>
-        <w:t xml:space="preserve"> and AWS</w:t>
-      </w:r>
+        <w:t xml:space="preserve">Responsible for Release management using CI/CD pipelines and </w:t>
+      </w:r>
+      <w:proofErr w:type="spellStart"/>
+      <w:r>
+        <w:t>GitLab</w:t>
+      </w:r>
+      <w:proofErr w:type="spellEnd"/>
       <w:r>
         <w:t xml:space="preserve"> </w:t>
+      </w:r>
+      <w:r>
+        <w:t>and AWS Services.</w:t>
       </w:r>
     </w:p>
     <w:p>
@@ -542,15 +565,13 @@
         <w:t xml:space="preserve">app </w:t>
       </w:r>
       <w:r>
-        <w:t xml:space="preserve">to </w:t>
-      </w:r>
-      <w:proofErr w:type="spellStart"/>
-      <w:r>
-        <w:t>Vite</w:t>
-      </w:r>
-      <w:proofErr w:type="spellEnd"/>
-      <w:r>
-        <w:t>, reducing build times by 70%</w:t>
+        <w:t xml:space="preserve">to Vite, </w:t>
+      </w:r>
+      <w:r>
+        <w:t>improving hot reload speed by 10x</w:t>
+      </w:r>
+      <w:r>
+        <w:t>.</w:t>
       </w:r>
     </w:p>
     <w:p>
@@ -558,7 +579,10 @@
         <w:pStyle w:val="ListBullet"/>
       </w:pPr>
       <w:r>
-        <w:t>Built fault-tolerant APIs with Polly (retry/circuit breaker), achieving 99.9% uptime.</w:t>
+        <w:t>B</w:t>
+      </w:r>
+      <w:r>
+        <w:t>uilt fault-tolerant APIs with Polly (retry/circuit breaker), achieving 99.9% uptime.</w:t>
       </w:r>
     </w:p>
     <w:p>
@@ -606,37 +630,32 @@
         <w:rPr>
           <w:b/>
         </w:rPr>
-        <w:lastRenderedPageBreak/>
-        <w:t>Associate Tech Lead</w:t>
-      </w:r>
-      <w:r>
-        <w:rPr>
-          <w:b/>
-        </w:rPr>
-        <w:t xml:space="preserve"> –</w:t>
-      </w:r>
-      <w:r>
-        <w:rPr>
-          <w:b/>
-        </w:rPr>
-        <w:t xml:space="preserve"> The Gifted Company</w:t>
-      </w:r>
-      <w:r>
-        <w:rPr>
-          <w:b/>
-        </w:rPr>
-        <w:t xml:space="preserve"> </w:t>
+        <w:t xml:space="preserve">Associate Tech Lead – The Gifted Company </w:t>
       </w:r>
       <w:r>
         <w:rPr>
           <w:b/>
           <w:sz w:val="20"/>
         </w:rPr>
-        <w:t>(Sweden)</w:t>
+        <w:t>(Sweden</w:t>
       </w:r>
       <w:r>
         <w:rPr>
           <w:b/>
+          <w:sz w:val="20"/>
+        </w:rPr>
+        <w:t xml:space="preserve"> based Business Operations</w:t>
+      </w:r>
+      <w:r>
+        <w:rPr>
+          <w:b/>
+          <w:sz w:val="20"/>
+        </w:rPr>
+        <w:t>)</w:t>
+      </w:r>
+      <w:r>
+        <w:rPr>
+          <w:b/>
         </w:rPr>
         <w:tab/>
       </w:r>
@@ -656,55 +675,83 @@
         <w:rPr>
           <w:b/>
         </w:rPr>
-        <w:tab/>
+        <w:br/>
       </w:r>
       <w:r>
         <w:rPr>
           <w:i/>
           <w:sz w:val="20"/>
         </w:rPr>
-        <w:t>Jan 20</w:t>
+        <w:t>Ju</w:t>
       </w:r>
       <w:r>
         <w:rPr>
           <w:i/>
           <w:sz w:val="20"/>
         </w:rPr>
-        <w:t>23</w:t>
+        <w:t>n</w:t>
       </w:r>
       <w:r>
         <w:rPr>
           <w:i/>
           <w:sz w:val="20"/>
         </w:rPr>
-        <w:t xml:space="preserve"> - Ju</w:t>
+        <w:t>e</w:t>
       </w:r>
       <w:r>
         <w:rPr>
           <w:i/>
           <w:sz w:val="20"/>
         </w:rPr>
-        <w:t>n</w:t>
+        <w:t xml:space="preserve"> 20</w:t>
       </w:r>
       <w:r>
         <w:rPr>
           <w:i/>
           <w:sz w:val="20"/>
         </w:rPr>
-        <w:t xml:space="preserve"> 20</w:t>
+        <w:t>2</w:t>
       </w:r>
       <w:r>
         <w:rPr>
           <w:i/>
           <w:sz w:val="20"/>
         </w:rPr>
-        <w:t>24</w:t>
+        <w:t>4</w:t>
       </w:r>
       <w:r>
         <w:rPr>
           <w:i/>
           <w:sz w:val="20"/>
         </w:rPr>
+        <w:t xml:space="preserve"> - Ju</w:t>
+      </w:r>
+      <w:r>
+        <w:rPr>
+          <w:i/>
+          <w:sz w:val="20"/>
+        </w:rPr>
+        <w:t>ly</w:t>
+      </w:r>
+      <w:r>
+        <w:rPr>
+          <w:i/>
+          <w:sz w:val="20"/>
+        </w:rPr>
+        <w:t xml:space="preserve"> 20</w:t>
+      </w:r>
+      <w:r>
+        <w:rPr>
+          <w:i/>
+          <w:sz w:val="20"/>
+        </w:rPr>
+        <w:t>25</w:t>
+      </w:r>
+      <w:r>
+        <w:rPr>
+          <w:i/>
+          <w:sz w:val="20"/>
+        </w:rPr>
         <w:br/>
       </w:r>
     </w:p>
@@ -730,16 +777,27 @@
       <w:r>
         <w:t>React &amp; Next.js (Typescript/JavaScript)</w:t>
       </w:r>
+      <w:r>
+        <w:t>.</w:t>
+      </w:r>
     </w:p>
     <w:p>
       <w:pPr>
         <w:pStyle w:val="ListBullet"/>
       </w:pPr>
       <w:r>
-        <w:t>Optimized front end application code to improve data loading time by 30%</w:t>
-      </w:r>
-      <w:r>
-        <w:t xml:space="preserve"> with Next Js Server Side Rendering</w:t>
+        <w:t xml:space="preserve">Optimized front end application code to improve data loading time by 30% with Next </w:t>
+      </w:r>
+      <w:proofErr w:type="spellStart"/>
+      <w:r>
+        <w:t>Js</w:t>
+      </w:r>
+      <w:proofErr w:type="spellEnd"/>
+      <w:r>
+        <w:t xml:space="preserve"> Server Side Rendering</w:t>
+      </w:r>
+      <w:r>
+        <w:t>.</w:t>
       </w:r>
     </w:p>
     <w:p>
@@ -761,19 +819,28 @@
         <w:pStyle w:val="ListBullet"/>
       </w:pPr>
       <w:r>
-        <w:t xml:space="preserve">Responsible for </w:t>
-      </w:r>
-      <w:r>
-        <w:t>implementing required customized G</w:t>
-      </w:r>
-      <w:r>
-        <w:t>oogle tags and integrated with Google Analytics</w:t>
-      </w:r>
-      <w:r>
-        <w:t xml:space="preserve"> dash</w:t>
-      </w:r>
-      <w:r>
-        <w:t xml:space="preserve"> boards to identify site traffic and user behavioral patterns </w:t>
+        <w:t>Responsible for implementing required customized G</w:t>
+      </w:r>
+      <w:r>
+        <w:t xml:space="preserve">oogle tags and integrated with </w:t>
+      </w:r>
+      <w:r>
+        <w:br/>
+      </w:r>
+      <w:r>
+        <w:t>Google Analytics</w:t>
+      </w:r>
+      <w:r>
+        <w:t xml:space="preserve"> </w:t>
+      </w:r>
+      <w:r>
+        <w:t>dash</w:t>
+      </w:r>
+      <w:r>
+        <w:t xml:space="preserve"> boards to identify site traff</w:t>
+      </w:r>
+      <w:r>
+        <w:t>ic and user behavioral patterns.</w:t>
       </w:r>
     </w:p>
     <w:p>
@@ -786,22 +853,204 @@
       <w:r>
         <w:t xml:space="preserve"> feature delivery with technical debt management</w:t>
       </w:r>
+      <w:r>
+        <w:t>.</w:t>
+      </w:r>
     </w:p>
     <w:p>
       <w:pPr>
         <w:pStyle w:val="ListBullet"/>
       </w:pPr>
       <w:r>
+        <w:t>Responsible for communicating</w:t>
+      </w:r>
+      <w:r>
+        <w:t xml:space="preserve"> risks, trade-offs, and decisions clearly</w:t>
+      </w:r>
+      <w:r>
+        <w:t xml:space="preserve"> with product team</w:t>
+      </w:r>
+      <w:r>
+        <w:t>.</w:t>
+      </w:r>
+    </w:p>
+    <w:p>
+      <w:pPr>
+        <w:rPr>
+          <w:sz w:val="20"/>
+        </w:rPr>
+      </w:pPr>
+      <w:r>
+        <w:rPr>
+          <w:b/>
+        </w:rPr>
+        <w:br/>
+      </w:r>
+      <w:r>
+        <w:rPr>
+          <w:b/>
+        </w:rPr>
+        <w:t xml:space="preserve">Associate </w:t>
+      </w:r>
+      <w:r>
+        <w:rPr>
+          <w:b/>
+        </w:rPr>
+        <w:t xml:space="preserve">Tech Lead - </w:t>
+      </w:r>
+      <w:proofErr w:type="spellStart"/>
+      <w:r>
+        <w:rPr>
+          <w:b/>
+        </w:rPr>
+        <w:t>Autoavans</w:t>
+      </w:r>
+      <w:proofErr w:type="spellEnd"/>
+      <w:r>
+        <w:rPr>
+          <w:b/>
+        </w:rPr>
+        <w:t xml:space="preserve"> Technology </w:t>
+      </w:r>
+      <w:r>
+        <w:rPr>
+          <w:b/>
+          <w:sz w:val="20"/>
+        </w:rPr>
+        <w:t>(Sweden</w:t>
+      </w:r>
+      <w:r>
+        <w:rPr>
+          <w:b/>
+          <w:sz w:val="20"/>
+        </w:rPr>
+        <w:t xml:space="preserve"> based Business Operations</w:t>
+      </w:r>
+      <w:r>
+        <w:rPr>
+          <w:b/>
+          <w:sz w:val="20"/>
+        </w:rPr>
+        <w:t>)</w:t>
+      </w:r>
+      <w:r>
+        <w:rPr>
+          <w:b/>
+        </w:rPr>
+        <w:tab/>
+      </w:r>
+      <w:r>
+        <w:rPr>
+          <w:b/>
+          <w:sz w:val="20"/>
+        </w:rPr>
+        <w:tab/>
+      </w:r>
+      <w:r>
+        <w:rPr>
+          <w:b/>
+          <w:sz w:val="20"/>
+        </w:rPr>
+        <w:br/>
+      </w:r>
+      <w:r>
+        <w:rPr>
+          <w:i/>
+          <w:sz w:val="20"/>
+        </w:rPr>
+        <w:t>July 202</w:t>
+      </w:r>
+      <w:r>
+        <w:rPr>
+          <w:i/>
+          <w:sz w:val="20"/>
+        </w:rPr>
+        <w:t>2</w:t>
+      </w:r>
+      <w:r>
+        <w:rPr>
+          <w:i/>
+          <w:sz w:val="20"/>
+        </w:rPr>
+        <w:t xml:space="preserve"> </w:t>
+      </w:r>
+      <w:r>
+        <w:rPr>
+          <w:i/>
+          <w:sz w:val="20"/>
+        </w:rPr>
+        <w:t>–</w:t>
+      </w:r>
+      <w:r>
+        <w:rPr>
+          <w:i/>
+          <w:sz w:val="20"/>
+        </w:rPr>
+        <w:t xml:space="preserve"> </w:t>
+      </w:r>
+      <w:r>
+        <w:rPr>
+          <w:i/>
+          <w:sz w:val="20"/>
+        </w:rPr>
+        <w:t>June 2024</w:t>
+      </w:r>
+    </w:p>
+    <w:p>
+      <w:pPr>
+        <w:pStyle w:val="ListBullet"/>
+      </w:pPr>
+      <w:r>
         <w:t xml:space="preserve">Responsible for </w:t>
       </w:r>
       <w:r>
-        <w:t>communicating</w:t>
-      </w:r>
-      <w:r>
-        <w:t xml:space="preserve"> risks, trade-offs, and decisions clearly</w:t>
-      </w:r>
-      <w:r>
-        <w:t xml:space="preserve"> with product team</w:t>
+        <w:t>migration from jQuery to React architecture, reducing regression bugs by 40% through automated testing.</w:t>
+      </w:r>
+    </w:p>
+    <w:p>
+      <w:pPr>
+        <w:pStyle w:val="ListBullet"/>
+        <w:tabs>
+          <w:tab w:val="clear" w:pos="360"/>
+        </w:tabs>
+      </w:pPr>
+      <w:r>
+        <w:t xml:space="preserve">Responsible for </w:t>
+      </w:r>
+      <w:r>
+        <w:t>Release</w:t>
+      </w:r>
+      <w:r>
+        <w:t xml:space="preserve"> management using CI/CD pipelines and </w:t>
+      </w:r>
+      <w:proofErr w:type="spellStart"/>
+      <w:r>
+        <w:t>GitLab</w:t>
+      </w:r>
+      <w:proofErr w:type="spellEnd"/>
+      <w:r>
+        <w:t xml:space="preserve"> and AWS </w:t>
+      </w:r>
+      <w:r>
+        <w:t>Services</w:t>
+      </w:r>
+      <w:r>
+        <w:t xml:space="preserve"> </w:t>
+      </w:r>
+      <w:r>
+        <w:br/>
+        <w:t>(Cloud Watch, S3 , AWS Secret Manger)</w:t>
+      </w:r>
+      <w:r>
+        <w:t>.</w:t>
+      </w:r>
+    </w:p>
+    <w:p>
+      <w:pPr>
+        <w:pStyle w:val="ListBullet"/>
+      </w:pPr>
+      <w:r>
+        <w:t>Mentored junior developers on clean code principles, SOLID, and modern JavaScript practices.</w:t>
       </w:r>
     </w:p>
     <w:p>
@@ -819,48 +1068,77 @@
         </w:rPr>
       </w:pPr>
       <w:r>
+        <w:rPr>
+          <w:b/>
+        </w:rPr>
         <w:br/>
       </w:r>
       <w:r>
         <w:rPr>
           <w:b/>
         </w:rPr>
-        <w:br/>
+        <w:t xml:space="preserve">Senior </w:t>
       </w:r>
       <w:r>
         <w:rPr>
           <w:b/>
         </w:rPr>
-        <w:br/>
+        <w:t>Software Engineer</w:t>
       </w:r>
       <w:r>
         <w:rPr>
           <w:b/>
         </w:rPr>
-        <w:t xml:space="preserve">Senior </w:t>
+        <w:t xml:space="preserve"> </w:t>
       </w:r>
       <w:r>
         <w:rPr>
           <w:b/>
         </w:rPr>
-        <w:t>Software Engineer</w:t>
+        <w:t>–</w:t>
       </w:r>
       <w:r>
         <w:rPr>
           <w:b/>
         </w:rPr>
-        <w:t xml:space="preserve"> – Mazarin Pvt Ltd </w:t>
+        <w:t xml:space="preserve"> </w:t>
+      </w:r>
+      <w:r>
+        <w:rPr>
+          <w:b/>
+        </w:rPr>
+        <w:t>Mazarin</w:t>
+      </w:r>
+      <w:r>
+        <w:rPr>
+          <w:b/>
+        </w:rPr>
+        <w:t xml:space="preserve"> </w:t>
       </w:r>
       <w:r>
         <w:rPr>
           <w:b/>
           <w:sz w:val="20"/>
         </w:rPr>
-        <w:t>(Sweden)</w:t>
+        <w:t>(Sweden</w:t>
       </w:r>
       <w:r>
         <w:rPr>
           <w:b/>
+          <w:sz w:val="20"/>
+        </w:rPr>
+        <w:t xml:space="preserve"> based Business Operations</w:t>
+      </w:r>
+      <w:r>
+        <w:rPr>
+          <w:b/>
+          <w:sz w:val="20"/>
+        </w:rPr>
+        <w:t>)</w:t>
+      </w:r>
+      <w:r>
+        <w:rPr>
+          <w:b/>
         </w:rPr>
         <w:tab/>
       </w:r>
@@ -881,19 +1159,38 @@
           <w:b/>
         </w:rPr>
         <w:tab/>
+      </w:r>
+      <w:r>
+        <w:rPr>
+          <w:b/>
+        </w:rPr>
+        <w:tab/>
+      </w:r>
+      <w:r>
+        <w:rPr>
+          <w:b/>
+        </w:rPr>
+        <w:br/>
       </w:r>
       <w:r>
         <w:rPr>
           <w:i/>
           <w:sz w:val="20"/>
         </w:rPr>
-        <w:t>Jan 2019 - Jul 2022</w:t>
+        <w:t>Sep 2019 - May</w:t>
       </w:r>
       <w:r>
         <w:rPr>
           <w:i/>
           <w:sz w:val="20"/>
         </w:rPr>
+        <w:t xml:space="preserve"> 2022</w:t>
+      </w:r>
+      <w:r>
+        <w:rPr>
+          <w:i/>
+          <w:sz w:val="20"/>
+        </w:rPr>
         <w:br/>
       </w:r>
     </w:p>
@@ -902,16 +1199,22 @@
         <w:pStyle w:val="ListBullet"/>
       </w:pPr>
       <w:r>
-        <w:t xml:space="preserve">Worked as an offshore consultant for </w:t>
-      </w:r>
-      <w:r>
-        <w:rPr>
-          <w:b/>
-        </w:rPr>
-        <w:t>Total Merchant Services USA</w:t>
-      </w:r>
-      <w:r>
-        <w:t>.</w:t>
+        <w:t>Worked on migration</w:t>
+      </w:r>
+      <w:r>
+        <w:t xml:space="preserve"> from </w:t>
+      </w:r>
+      <w:r>
+        <w:t xml:space="preserve">C# </w:t>
+      </w:r>
+      <w:r>
+        <w:t xml:space="preserve">to React </w:t>
+      </w:r>
+      <w:r>
+        <w:t xml:space="preserve">.NET Core </w:t>
+      </w:r>
+      <w:r>
+        <w:t>architecture, reducing regression bugs by 40% through automated testing.</w:t>
       </w:r>
     </w:p>
     <w:p>
@@ -919,7 +1222,728 @@
         <w:pStyle w:val="ListBullet"/>
       </w:pPr>
       <w:r>
+        <w:t>Participated in sprint planning with poker planning and collaborated on feature prioritization.</w:t>
+      </w:r>
+    </w:p>
+    <w:p>
+      <w:pPr>
+        <w:pStyle w:val="ListBullet"/>
+        <w:numPr>
+          <w:ilvl w:val="0"/>
+          <w:numId w:val="0"/>
+        </w:numPr>
+        <w:ind w:left="720" w:hanging="360"/>
+      </w:pPr>
+    </w:p>
+    <w:p>
+      <w:pPr>
+        <w:pStyle w:val="ListBullet"/>
+        <w:numPr>
+          <w:ilvl w:val="0"/>
+          <w:numId w:val="0"/>
+        </w:numPr>
+        <w:tabs>
+          <w:tab w:val="left" w:pos="450"/>
+        </w:tabs>
+        <w:rPr>
+          <w:b/>
+        </w:rPr>
+      </w:pPr>
+      <w:r>
+        <w:rPr>
+          <w:b/>
+        </w:rPr>
+        <w:t>Software Engineer</w:t>
+      </w:r>
+      <w:r>
+        <w:rPr>
+          <w:b/>
+        </w:rPr>
+        <w:t xml:space="preserve"> – Mazarin</w:t>
+      </w:r>
+      <w:r>
+        <w:rPr>
+          <w:b/>
+        </w:rPr>
+        <w:t xml:space="preserve"> </w:t>
+      </w:r>
+      <w:r>
+        <w:rPr>
+          <w:b/>
+          <w:sz w:val="20"/>
+        </w:rPr>
+        <w:t>(Sweden</w:t>
+      </w:r>
+      <w:r>
+        <w:rPr>
+          <w:b/>
+          <w:sz w:val="20"/>
+        </w:rPr>
+        <w:t xml:space="preserve"> based Business Operations</w:t>
+      </w:r>
+      <w:r>
+        <w:rPr>
+          <w:b/>
+          <w:sz w:val="20"/>
+        </w:rPr>
+        <w:t>)</w:t>
+      </w:r>
+      <w:r>
+        <w:rPr>
+          <w:b/>
+        </w:rPr>
+        <w:tab/>
+      </w:r>
+      <w:r>
+        <w:rPr>
+          <w:b/>
+        </w:rPr>
+        <w:tab/>
+      </w:r>
+      <w:r>
+        <w:rPr>
+          <w:b/>
+        </w:rPr>
+        <w:tab/>
+      </w:r>
+      <w:r>
+        <w:rPr>
+          <w:b/>
+        </w:rPr>
+        <w:tab/>
+      </w:r>
+      <w:r>
+        <w:rPr>
+          <w:b/>
+        </w:rPr>
+        <w:tab/>
+      </w:r>
+      <w:r>
+        <w:rPr>
+          <w:b/>
+        </w:rPr>
+        <w:br/>
+      </w:r>
+      <w:r>
+        <w:rPr>
+          <w:i/>
+          <w:sz w:val="20"/>
+        </w:rPr>
+        <w:t>Aug</w:t>
+      </w:r>
+      <w:r>
+        <w:rPr>
+          <w:i/>
+          <w:sz w:val="20"/>
+        </w:rPr>
+        <w:t xml:space="preserve"> 201</w:t>
+      </w:r>
+      <w:r>
+        <w:rPr>
+          <w:i/>
+          <w:sz w:val="20"/>
+        </w:rPr>
+        <w:t>7 - Aug 2019</w:t>
+      </w:r>
+      <w:r>
+        <w:rPr>
+          <w:i/>
+          <w:sz w:val="20"/>
+        </w:rPr>
+        <w:br/>
+      </w:r>
+    </w:p>
+    <w:p>
+      <w:pPr>
+        <w:pStyle w:val="ListBullet"/>
+      </w:pPr>
+      <w:r>
+        <w:t xml:space="preserve">Worked as an offshore consultant for </w:t>
+      </w:r>
+      <w:r>
+        <w:rPr>
+          <w:b/>
+        </w:rPr>
+        <w:t>Total Merchant Services USA</w:t>
+      </w:r>
+      <w:r>
+        <w:t>.</w:t>
+      </w:r>
+    </w:p>
+    <w:p>
+      <w:pPr>
+        <w:pStyle w:val="ListBullet"/>
+      </w:pPr>
+      <w:r>
+        <w:t>Collaborated with product managers to define technical requirements and provide effort estimations for quarterly roadmaps.</w:t>
+      </w:r>
+    </w:p>
+    <w:p>
+      <w:pPr>
+        <w:pStyle w:val="ListBullet"/>
+        <w:numPr>
+          <w:ilvl w:val="0"/>
+          <w:numId w:val="0"/>
+        </w:numPr>
+        <w:ind w:left="360" w:hanging="360"/>
+      </w:pPr>
+    </w:p>
+    <w:p>
+      <w:pPr>
+        <w:pStyle w:val="ListBullet"/>
+        <w:numPr>
+          <w:ilvl w:val="0"/>
+          <w:numId w:val="0"/>
+        </w:numPr>
+        <w:tabs>
+          <w:tab w:val="left" w:pos="450"/>
+        </w:tabs>
+        <w:rPr>
+          <w:b/>
+        </w:rPr>
+      </w:pPr>
+      <w:r>
+        <w:rPr>
+          <w:b/>
+        </w:rPr>
+        <w:t>Associate software</w:t>
+      </w:r>
+      <w:r>
+        <w:rPr>
+          <w:b/>
+        </w:rPr>
+        <w:t xml:space="preserve"> Engineer</w:t>
+      </w:r>
+      <w:r>
+        <w:rPr>
+          <w:b/>
+        </w:rPr>
+        <w:t xml:space="preserve"> – </w:t>
+      </w:r>
+      <w:r>
+        <w:rPr>
+          <w:b/>
+        </w:rPr>
+        <w:t xml:space="preserve">Mazarin </w:t>
+      </w:r>
+      <w:r>
+        <w:rPr>
+          <w:b/>
+          <w:sz w:val="20"/>
+        </w:rPr>
+        <w:t>(Sweden</w:t>
+      </w:r>
+      <w:r>
+        <w:rPr>
+          <w:b/>
+          <w:sz w:val="20"/>
+        </w:rPr>
+        <w:t xml:space="preserve"> based Business Operations</w:t>
+      </w:r>
+      <w:r>
+        <w:rPr>
+          <w:b/>
+          <w:sz w:val="20"/>
+        </w:rPr>
+        <w:t>)</w:t>
+      </w:r>
+      <w:r>
+        <w:rPr>
+          <w:b/>
+        </w:rPr>
+        <w:tab/>
+      </w:r>
+      <w:r>
+        <w:rPr>
+          <w:b/>
+        </w:rPr>
+        <w:tab/>
+      </w:r>
+      <w:r>
+        <w:rPr>
+          <w:b/>
+        </w:rPr>
+        <w:tab/>
+      </w:r>
+      <w:r>
+        <w:rPr>
+          <w:b/>
+        </w:rPr>
+        <w:tab/>
+      </w:r>
+      <w:r>
+        <w:rPr>
+          <w:b/>
+        </w:rPr>
+        <w:br/>
+      </w:r>
+      <w:r>
+        <w:rPr>
+          <w:i/>
+          <w:sz w:val="20"/>
+        </w:rPr>
+        <w:t>Sep</w:t>
+      </w:r>
+      <w:r>
+        <w:rPr>
+          <w:i/>
+          <w:sz w:val="20"/>
+        </w:rPr>
+        <w:t xml:space="preserve"> 201</w:t>
+      </w:r>
+      <w:r>
+        <w:rPr>
+          <w:i/>
+          <w:sz w:val="20"/>
+        </w:rPr>
+        <w:t>6</w:t>
+      </w:r>
+      <w:r>
+        <w:rPr>
+          <w:i/>
+          <w:sz w:val="20"/>
+        </w:rPr>
+        <w:t xml:space="preserve"> - </w:t>
+      </w:r>
+      <w:r>
+        <w:rPr>
+          <w:i/>
+          <w:sz w:val="20"/>
+        </w:rPr>
+        <w:t>Sep</w:t>
+      </w:r>
+      <w:r>
+        <w:rPr>
+          <w:i/>
+          <w:sz w:val="20"/>
+        </w:rPr>
+        <w:t xml:space="preserve"> </w:t>
+      </w:r>
+      <w:r>
+        <w:rPr>
+          <w:i/>
+          <w:sz w:val="20"/>
+        </w:rPr>
+        <w:t>2017</w:t>
+      </w:r>
+      <w:r>
+        <w:rPr>
+          <w:i/>
+          <w:sz w:val="20"/>
+        </w:rPr>
+        <w:br/>
+      </w:r>
+    </w:p>
+    <w:p>
+      <w:pPr>
+        <w:pStyle w:val="ListBullet"/>
+      </w:pPr>
+      <w:r>
+        <w:t xml:space="preserve">Developed payment processing platform </w:t>
+      </w:r>
+      <w:r>
+        <w:t xml:space="preserve">features </w:t>
+      </w:r>
+      <w:r>
+        <w:t>handling $12B+ annually for 500K+ merchants.</w:t>
+      </w:r>
+    </w:p>
+    <w:p>
+      <w:pPr>
+        <w:pStyle w:val="ListBullet"/>
+      </w:pPr>
+      <w:r>
+        <w:t>Built customer management, inventory systems, and SSO solution using ASP.NET MVC and C#.</w:t>
+      </w:r>
+    </w:p>
+    <w:p>
+      <w:pPr>
+        <w:pStyle w:val="ListBullet"/>
+      </w:pPr>
+      <w:r>
         <w:t>Participated in sprint planning with poker planning and collaborated on feature prioritization</w:t>
+      </w:r>
+      <w:r>
+        <w:t>.</w:t>
+      </w:r>
+    </w:p>
+    <w:p>
+      <w:pPr>
+        <w:pStyle w:val="ListBullet"/>
+        <w:numPr>
+          <w:ilvl w:val="0"/>
+          <w:numId w:val="0"/>
+        </w:numPr>
+        <w:tabs>
+          <w:tab w:val="left" w:pos="450"/>
+        </w:tabs>
+        <w:rPr>
+          <w:b/>
+        </w:rPr>
+      </w:pPr>
+      <w:r>
+        <w:lastRenderedPageBreak/>
+        <w:br/>
+      </w:r>
+      <w:r>
+        <w:rPr>
+          <w:b/>
+        </w:rPr>
+        <w:br/>
+      </w:r>
+      <w:r>
+        <w:rPr>
+          <w:b/>
+        </w:rPr>
+        <w:br/>
+      </w:r>
+      <w:r>
+        <w:rPr>
+          <w:b/>
+        </w:rPr>
+        <w:br/>
+      </w:r>
+      <w:r>
+        <w:rPr>
+          <w:b/>
+        </w:rPr>
+        <w:t xml:space="preserve">Trainee </w:t>
+      </w:r>
+      <w:r>
+        <w:rPr>
+          <w:b/>
+        </w:rPr>
+        <w:t xml:space="preserve"> software</w:t>
+      </w:r>
+      <w:r>
+        <w:rPr>
+          <w:b/>
+        </w:rPr>
+        <w:t xml:space="preserve"> Engineer</w:t>
+      </w:r>
+      <w:r>
+        <w:rPr>
+          <w:b/>
+        </w:rPr>
+        <w:t xml:space="preserve"> – </w:t>
+      </w:r>
+      <w:r>
+        <w:rPr>
+          <w:b/>
+          <w:sz w:val="20"/>
+        </w:rPr>
+        <w:t>(Sweden</w:t>
+      </w:r>
+      <w:r>
+        <w:rPr>
+          <w:b/>
+          <w:sz w:val="20"/>
+        </w:rPr>
+        <w:t xml:space="preserve"> based Business Operations</w:t>
+      </w:r>
+      <w:r>
+        <w:rPr>
+          <w:b/>
+          <w:sz w:val="20"/>
+        </w:rPr>
+        <w:t>)</w:t>
+      </w:r>
+      <w:r>
+        <w:rPr>
+          <w:b/>
+        </w:rPr>
+        <w:tab/>
+      </w:r>
+      <w:r>
+        <w:rPr>
+          <w:b/>
+        </w:rPr>
+        <w:tab/>
+      </w:r>
+      <w:r>
+        <w:rPr>
+          <w:b/>
+        </w:rPr>
+        <w:tab/>
+      </w:r>
+      <w:r>
+        <w:rPr>
+          <w:b/>
+        </w:rPr>
+        <w:tab/>
+      </w:r>
+      <w:r>
+        <w:rPr>
+          <w:b/>
+        </w:rPr>
+        <w:tab/>
+      </w:r>
+      <w:r>
+        <w:rPr>
+          <w:b/>
+        </w:rPr>
+        <w:br/>
+      </w:r>
+      <w:r>
+        <w:rPr>
+          <w:i/>
+          <w:sz w:val="20"/>
+        </w:rPr>
+        <w:t>Sep</w:t>
+      </w:r>
+      <w:r>
+        <w:rPr>
+          <w:i/>
+          <w:sz w:val="20"/>
+        </w:rPr>
+        <w:t xml:space="preserve"> 201</w:t>
+      </w:r>
+      <w:r>
+        <w:rPr>
+          <w:i/>
+          <w:sz w:val="20"/>
+        </w:rPr>
+        <w:t>1</w:t>
+      </w:r>
+      <w:r>
+        <w:rPr>
+          <w:i/>
+          <w:sz w:val="20"/>
+        </w:rPr>
+        <w:t xml:space="preserve"> - </w:t>
+      </w:r>
+      <w:r>
+        <w:rPr>
+          <w:i/>
+          <w:sz w:val="20"/>
+        </w:rPr>
+        <w:t>Sep</w:t>
+      </w:r>
+      <w:r>
+        <w:rPr>
+          <w:i/>
+          <w:sz w:val="20"/>
+        </w:rPr>
+        <w:t xml:space="preserve"> </w:t>
+      </w:r>
+      <w:r>
+        <w:rPr>
+          <w:i/>
+          <w:sz w:val="20"/>
+        </w:rPr>
+        <w:t>201</w:t>
+      </w:r>
+      <w:r>
+        <w:rPr>
+          <w:i/>
+          <w:sz w:val="20"/>
+        </w:rPr>
+        <w:t>6</w:t>
+      </w:r>
+      <w:r>
+        <w:rPr>
+          <w:i/>
+          <w:sz w:val="20"/>
+        </w:rPr>
+        <w:br/>
+      </w:r>
+    </w:p>
+    <w:p>
+      <w:pPr>
+        <w:pStyle w:val="ListBullet"/>
+      </w:pPr>
+      <w:r>
+        <w:t xml:space="preserve">Worked as </w:t>
+      </w:r>
+      <w:r>
+        <w:t>a</w:t>
+      </w:r>
+      <w:r>
+        <w:t xml:space="preserve"> </w:t>
+      </w:r>
+      <w:r>
+        <w:t xml:space="preserve">part time </w:t>
+      </w:r>
+      <w:r>
+        <w:t>Intern while studying for my bachelor degree</w:t>
+      </w:r>
+      <w:r>
+        <w:t xml:space="preserve"> program </w:t>
+      </w:r>
+      <w:r>
+        <w:t xml:space="preserve"> </w:t>
+      </w:r>
+    </w:p>
+    <w:p>
+      <w:pPr>
+        <w:pStyle w:val="ListBullet"/>
+      </w:pPr>
+      <w:r>
+        <w:t>Developed full</w:t>
+      </w:r>
+      <w:r>
+        <w:t xml:space="preserve"> stack web application features with C# .NET &amp; MS SQL Server 2008</w:t>
+      </w:r>
+      <w:r>
+        <w:t>.</w:t>
+      </w:r>
+    </w:p>
+    <w:p>
+      <w:pPr>
+        <w:pStyle w:val="ListBullet"/>
+      </w:pPr>
+      <w:r>
+        <w:t>Responsible for performing developer testing on the application report issues to the team</w:t>
+      </w:r>
+      <w:r>
+        <w:t>.</w:t>
+      </w:r>
+      <w:r>
+        <w:t xml:space="preserve"> </w:t>
+      </w:r>
+      <w:r>
+        <w:br/>
+      </w:r>
+    </w:p>
+    <w:p>
+      <w:pPr>
+        <w:pStyle w:val="Heading1"/>
+        <w:rPr>
+          <w:caps/>
+        </w:rPr>
+      </w:pPr>
+      <w:r>
+        <w:rPr>
+          <w:caps/>
+        </w:rPr>
+        <w:t>Education</w:t>
+      </w:r>
+      <w:r>
+        <w:rPr>
+          <w:caps/>
+        </w:rPr>
+        <w:br/>
+      </w:r>
+    </w:p>
+    <w:p>
+      <w:pPr>
+        <w:pStyle w:val="ListBullet"/>
+        <w:tabs>
+          <w:tab w:val="clear" w:pos="360"/>
+        </w:tabs>
+      </w:pPr>
+      <w:r>
+        <w:rPr>
+          <w:b/>
+          <w:sz w:val="20"/>
+        </w:rPr>
+        <w:t>B</w:t>
+      </w:r>
+      <w:r>
+        <w:rPr>
+          <w:b/>
+          <w:sz w:val="20"/>
+        </w:rPr>
+        <w:t>Eng</w:t>
+      </w:r>
+      <w:r>
+        <w:rPr>
+          <w:b/>
+          <w:sz w:val="20"/>
+        </w:rPr>
+        <w:t xml:space="preserve"> (Hons) in </w:t>
+      </w:r>
+      <w:r>
+        <w:rPr>
+          <w:b/>
+          <w:sz w:val="20"/>
+        </w:rPr>
+        <w:t>Software Engineering</w:t>
+      </w:r>
+      <w:r>
+        <w:rPr>
+          <w:b/>
+          <w:sz w:val="20"/>
+        </w:rPr>
+        <w:t xml:space="preserve"> - Second Class </w:t>
+      </w:r>
+      <w:r>
+        <w:rPr>
+          <w:b/>
+          <w:sz w:val="20"/>
+        </w:rPr>
+        <w:t>Honors</w:t>
+      </w:r>
+      <w:r>
+        <w:rPr>
+          <w:b/>
+          <w:sz w:val="20"/>
+        </w:rPr>
+        <w:t xml:space="preserve"> </w:t>
+      </w:r>
+      <w:r>
+        <w:rPr>
+          <w:b/>
+          <w:sz w:val="20"/>
+        </w:rPr>
+        <w:t>: First Division</w:t>
+      </w:r>
+      <w:r>
+        <w:rPr>
+          <w:i/>
+        </w:rPr>
+        <w:tab/>
+      </w:r>
+      <w:r>
+        <w:rPr>
+          <w:i/>
+        </w:rPr>
+        <w:tab/>
+      </w:r>
+      <w:r>
+        <w:rPr>
+          <w:i/>
+          <w:sz w:val="20"/>
+        </w:rPr>
+        <w:t>Sep 2010 - Sep 2015</w:t>
+      </w:r>
+      <w:r>
+        <w:rPr>
+          <w:i/>
+        </w:rPr>
+        <w:br/>
+      </w:r>
+      <w:r>
+        <w:t>University of Westminster, United Kingdom</w:t>
+      </w:r>
+      <w:r>
+        <w:t>.</w:t>
+      </w:r>
+      <w:r>
+        <w:br/>
+      </w:r>
+      <w:r>
+        <w:br/>
+      </w:r>
+    </w:p>
+    <w:p>
+      <w:pPr>
+        <w:pStyle w:val="ListBullet"/>
+        <w:numPr>
+          <w:ilvl w:val="0"/>
+          <w:numId w:val="0"/>
+        </w:numPr>
+      </w:pPr>
+      <w:r>
+        <w:rPr>
+          <w:rFonts w:asciiTheme="majorHAnsi" w:eastAsiaTheme="majorEastAsia" w:hAnsiTheme="majorHAnsi" w:cstheme="majorBidi"/>
+          <w:b/>
+          <w:bCs/>
+          <w:color w:val="365F91" w:themeColor="accent1" w:themeShade="BF"/>
+          <w:sz w:val="28"/>
+          <w:szCs w:val="28"/>
+        </w:rPr>
+        <w:t>ADDITIONAL INFORMATION</w:t>
       </w:r>
     </w:p>
     <w:p>
@@ -931,201 +1955,67 @@
         </w:numPr>
         <w:ind w:left="360"/>
       </w:pPr>
-      <w:r>
-        <w:t>Collaborated with product managers to define technical requirements and provide effort estimations for quarterly roadmaps.</w:t>
-      </w:r>
     </w:p>
     <w:p>
       <w:pPr>
         <w:pStyle w:val="ListBullet"/>
       </w:pPr>
       <w:r>
-        <w:t xml:space="preserve">Developed core modules for an international eCommerce platform using </w:t>
-      </w:r>
-      <w:r>
-        <w:t>React and C#, Node js</w:t>
-      </w:r>
-      <w:r>
-        <w:t>.</w:t>
-      </w:r>
+        <w:rPr>
+          <w:b/>
+        </w:rPr>
+        <w:t>Languages</w:t>
+      </w:r>
+      <w:r>
+        <w:t>: English (Fluent), Sinhala (Native)</w:t>
+      </w:r>
+      <w:r>
+        <w:br/>
+      </w:r>
+      <w:bookmarkStart w:id="0" w:name="_GoBack"/>
+      <w:bookmarkEnd w:id="0"/>
     </w:p>
     <w:p>
       <w:pPr>
         <w:pStyle w:val="ListBullet"/>
       </w:pPr>
       <w:r>
-        <w:t>Optimized database queries and indexing strategies, improving application response time by 25%.</w:t>
+        <w:rPr>
+          <w:b/>
+        </w:rPr>
+        <w:t>Key</w:t>
+      </w:r>
+      <w:r>
+        <w:t xml:space="preserve"> </w:t>
+      </w:r>
+      <w:r>
+        <w:rPr>
+          <w:b/>
+        </w:rPr>
+        <w:t>Strengths</w:t>
+      </w:r>
+      <w:r>
+        <w:t>: Team Leadership, Architecture Design, Performance Optimization, Agile Project Management, Technical Mentoring, Conflict Resolution</w:t>
+      </w:r>
+      <w:r>
+        <w:t>.</w:t>
+      </w:r>
+      <w:r>
+        <w:br/>
       </w:r>
     </w:p>
     <w:p>
       <w:pPr>
-        <w:pStyle w:val="Heading1"/>
-        <w:rPr>
-          <w:caps/>
-        </w:rPr>
-      </w:pPr>
-      <w:r>
-        <w:rPr>
-          <w:caps/>
-        </w:rPr>
-        <w:t>Education</w:t>
-      </w:r>
-      <w:r>
-        <w:rPr>
-          <w:caps/>
-        </w:rPr>
-        <w:br/>
-      </w:r>
-    </w:p>
-    <w:p>
-      <w:pPr>
         <w:pStyle w:val="ListBullet"/>
-        <w:tabs>
-          <w:tab w:val="clear" w:pos="360"/>
-        </w:tabs>
       </w:pPr>
       <w:r>
         <w:rPr>
           <w:b/>
-          <w:sz w:val="20"/>
-        </w:rPr>
-        <w:t>B</w:t>
-      </w:r>
-      <w:r>
-        <w:rPr>
-          <w:b/>
-          <w:sz w:val="20"/>
-        </w:rPr>
-        <w:t>Eng</w:t>
-      </w:r>
-      <w:r>
-        <w:rPr>
-          <w:b/>
-          <w:sz w:val="20"/>
-        </w:rPr>
-        <w:t xml:space="preserve"> (Hons) in </w:t>
-      </w:r>
-      <w:r>
-        <w:rPr>
-          <w:b/>
-          <w:sz w:val="20"/>
-        </w:rPr>
-        <w:t>Software Engineering</w:t>
-      </w:r>
-      <w:r>
-        <w:rPr>
-          <w:b/>
-          <w:sz w:val="20"/>
-        </w:rPr>
-        <w:t xml:space="preserve"> - Second Class </w:t>
-      </w:r>
-      <w:r>
-        <w:rPr>
-          <w:b/>
-          <w:sz w:val="20"/>
-        </w:rPr>
-        <w:t>Honors</w:t>
-      </w:r>
-      <w:r>
-        <w:rPr>
-          <w:b/>
-          <w:sz w:val="20"/>
-        </w:rPr>
-        <w:t xml:space="preserve"> </w:t>
-      </w:r>
-      <w:r>
-        <w:rPr>
-          <w:b/>
-          <w:sz w:val="20"/>
-        </w:rPr>
-        <w:t>: First Division</w:t>
-      </w:r>
-      <w:r>
-        <w:rPr>
-          <w:i/>
-        </w:rPr>
-        <w:tab/>
-      </w:r>
-      <w:r>
-        <w:rPr>
-          <w:i/>
-        </w:rPr>
-        <w:tab/>
-      </w:r>
-      <w:r>
-        <w:rPr>
-          <w:i/>
-          <w:sz w:val="20"/>
-        </w:rPr>
-        <w:t>Sep 2010 - Sep 2015</w:t>
-      </w:r>
-      <w:r>
-        <w:rPr>
-          <w:i/>
-        </w:rPr>
-        <w:br/>
-      </w:r>
-      <w:r>
-        <w:rPr>
-          <w:i/>
-        </w:rPr>
-        <w:br/>
-      </w:r>
-      <w:r>
-        <w:t>University of Westminster, United Kingdom</w:t>
-      </w:r>
-      <w:r>
-        <w:br/>
-      </w:r>
-      <w:r>
-        <w:br/>
-      </w:r>
-    </w:p>
-    <w:p>
-      <w:pPr>
-        <w:pStyle w:val="ListBullet"/>
-        <w:numPr>
-          <w:ilvl w:val="0"/>
-          <w:numId w:val="0"/>
-        </w:numPr>
-      </w:pPr>
-      <w:r>
-        <w:rPr>
-          <w:rFonts w:asciiTheme="majorHAnsi" w:eastAsiaTheme="majorEastAsia" w:hAnsiTheme="majorHAnsi" w:cstheme="majorBidi"/>
-          <w:b/>
-          <w:bCs/>
-          <w:color w:val="365F91" w:themeColor="accent1" w:themeShade="BF"/>
-          <w:sz w:val="28"/>
-          <w:szCs w:val="28"/>
-        </w:rPr>
-        <w:t>ADDITIONAL INFORMATION</w:t>
-      </w:r>
-    </w:p>
-    <w:p>
-      <w:pPr>
-        <w:pStyle w:val="ListBullet"/>
-        <w:numPr>
-          <w:ilvl w:val="0"/>
-          <w:numId w:val="0"/>
-        </w:numPr>
-        <w:ind w:left="360" w:hanging="360"/>
-      </w:pPr>
-    </w:p>
-    <w:p>
-      <w:pPr>
-        <w:pStyle w:val="ListBullet"/>
-      </w:pPr>
-      <w:r>
-        <w:rPr>
-          <w:b/>
         </w:rPr>
         <w:t>Certifications</w:t>
       </w:r>
       <w:r>
-        <w:t xml:space="preserve">: </w:t>
-      </w:r>
-      <w:r>
-        <w:t>AWS Certified Solutions Architect – Associate (SAA-C03)</w:t>
+        <w:t>: AWS Certified Solutions Architect – Associate (SAA-C03)</w:t>
       </w:r>
       <w:r>
         <w:br/>
@@ -1135,64 +2025,9 @@
           <w:rPr>
             <w:rStyle w:val="Hyperlink"/>
           </w:rPr>
-          <w:t>https://www.credly.com/ba</w:t>
-        </w:r>
-        <w:r>
-          <w:rPr>
-            <w:rStyle w:val="Hyperlink"/>
-          </w:rPr>
-          <w:t>d</w:t>
-        </w:r>
-        <w:r>
-          <w:rPr>
-            <w:rStyle w:val="Hyperlink"/>
-          </w:rPr>
-          <w:t>ges/01da665b-bcfd-49d1-afc7-421f91ba30cc</w:t>
+          <w:t>https://www.credly.com/badges/01da665b-bcfd-49d1-afc7-421f91ba30cc</w:t>
         </w:r>
       </w:hyperlink>
-      <w:r>
-        <w:br/>
-      </w:r>
-    </w:p>
-    <w:p>
-      <w:pPr>
-        <w:pStyle w:val="ListBullet"/>
-      </w:pPr>
-      <w:r>
-        <w:rPr>
-          <w:b/>
-        </w:rPr>
-        <w:t>Languages</w:t>
-      </w:r>
-      <w:r>
-        <w:t>: English (Fluent), Sinhala (Native)</w:t>
-      </w:r>
-      <w:r>
-        <w:br/>
-      </w:r>
-    </w:p>
-    <w:p>
-      <w:pPr>
-        <w:pStyle w:val="ListBullet"/>
-      </w:pPr>
-      <w:r>
-        <w:rPr>
-          <w:b/>
-        </w:rPr>
-        <w:t>Key</w:t>
-      </w:r>
-      <w:r>
-        <w:t xml:space="preserve"> </w:t>
-      </w:r>
-      <w:r>
-        <w:rPr>
-          <w:b/>
-        </w:rPr>
-        <w:t>Strengths</w:t>
-      </w:r>
-      <w:r>
-        <w:t>: Team Leadership, Architecture Design, Performance Optimization, Agile Project Management, Technical Mentoring, Conflict Resolution</w:t>
-      </w:r>
     </w:p>
     <w:sectPr>
       <w:pgSz w:w="12240" w:h="15840"/>
@@ -1378,6 +2213,232 @@
     </w:lvl>
   </w:abstractNum>
   <w:abstractNum w:abstractNumId="9" w15:restartNumberingAfterBreak="0">
+    <w:nsid w:val="439F76D8"/>
+    <w:multiLevelType w:val="hybridMultilevel"/>
+    <w:tmpl w:val="01C05D60"/>
+    <w:lvl w:ilvl="0" w:tplc="04090001">
+      <w:start w:val="1"/>
+      <w:numFmt w:val="bullet"/>
+      <w:lvlText w:val=""/>
+      <w:lvlJc w:val="left"/>
+      <w:pPr>
+        <w:ind w:left="720" w:hanging="360"/>
+      </w:pPr>
+      <w:rPr>
+        <w:rFonts w:ascii="Symbol" w:hAnsi="Symbol" w:hint="default"/>
+      </w:rPr>
+    </w:lvl>
+    <w:lvl w:ilvl="1" w:tplc="04090003" w:tentative="1">
+      <w:start w:val="1"/>
+      <w:numFmt w:val="bullet"/>
+      <w:lvlText w:val="o"/>
+      <w:lvlJc w:val="left"/>
+      <w:pPr>
+        <w:ind w:left="1440" w:hanging="360"/>
+      </w:pPr>
+      <w:rPr>
+        <w:rFonts w:ascii="Courier New" w:hAnsi="Courier New" w:cs="Courier New" w:hint="default"/>
+      </w:rPr>
+    </w:lvl>
+    <w:lvl w:ilvl="2" w:tplc="04090005" w:tentative="1">
+      <w:start w:val="1"/>
+      <w:numFmt w:val="bullet"/>
+      <w:lvlText w:val=""/>
+      <w:lvlJc w:val="left"/>
+      <w:pPr>
+        <w:ind w:left="2160" w:hanging="360"/>
+      </w:pPr>
+      <w:rPr>
+        <w:rFonts w:ascii="Wingdings" w:hAnsi="Wingdings" w:hint="default"/>
+      </w:rPr>
+    </w:lvl>
+    <w:lvl w:ilvl="3" w:tplc="04090001" w:tentative="1">
+      <w:start w:val="1"/>
+      <w:numFmt w:val="bullet"/>
+      <w:lvlText w:val=""/>
+      <w:lvlJc w:val="left"/>
+      <w:pPr>
+        <w:ind w:left="2880" w:hanging="360"/>
+      </w:pPr>
+      <w:rPr>
+        <w:rFonts w:ascii="Symbol" w:hAnsi="Symbol" w:hint="default"/>
+      </w:rPr>
+    </w:lvl>
+    <w:lvl w:ilvl="4" w:tplc="04090003" w:tentative="1">
+      <w:start w:val="1"/>
+      <w:numFmt w:val="bullet"/>
+      <w:lvlText w:val="o"/>
+      <w:lvlJc w:val="left"/>
+      <w:pPr>
+        <w:ind w:left="3600" w:hanging="360"/>
+      </w:pPr>
+      <w:rPr>
+        <w:rFonts w:ascii="Courier New" w:hAnsi="Courier New" w:cs="Courier New" w:hint="default"/>
+      </w:rPr>
+    </w:lvl>
+    <w:lvl w:ilvl="5" w:tplc="04090005" w:tentative="1">
+      <w:start w:val="1"/>
+      <w:numFmt w:val="bullet"/>
+      <w:lvlText w:val=""/>
+      <w:lvlJc w:val="left"/>
+      <w:pPr>
+        <w:ind w:left="4320" w:hanging="360"/>
+      </w:pPr>
+      <w:rPr>
+        <w:rFonts w:ascii="Wingdings" w:hAnsi="Wingdings" w:hint="default"/>
+      </w:rPr>
+    </w:lvl>
+    <w:lvl w:ilvl="6" w:tplc="04090001" w:tentative="1">
+      <w:start w:val="1"/>
+      <w:numFmt w:val="bullet"/>
+      <w:lvlText w:val=""/>
+      <w:lvlJc w:val="left"/>
+      <w:pPr>
+        <w:ind w:left="5040" w:hanging="360"/>
+      </w:pPr>
+      <w:rPr>
+        <w:rFonts w:ascii="Symbol" w:hAnsi="Symbol" w:hint="default"/>
+      </w:rPr>
+    </w:lvl>
+    <w:lvl w:ilvl="7" w:tplc="04090003" w:tentative="1">
+      <w:start w:val="1"/>
+      <w:numFmt w:val="bullet"/>
+      <w:lvlText w:val="o"/>
+      <w:lvlJc w:val="left"/>
+      <w:pPr>
+        <w:ind w:left="5760" w:hanging="360"/>
+      </w:pPr>
+      <w:rPr>
+        <w:rFonts w:ascii="Courier New" w:hAnsi="Courier New" w:cs="Courier New" w:hint="default"/>
+      </w:rPr>
+    </w:lvl>
+    <w:lvl w:ilvl="8" w:tplc="04090005" w:tentative="1">
+      <w:start w:val="1"/>
+      <w:numFmt w:val="bullet"/>
+      <w:lvlText w:val=""/>
+      <w:lvlJc w:val="left"/>
+      <w:pPr>
+        <w:ind w:left="6480" w:hanging="360"/>
+      </w:pPr>
+      <w:rPr>
+        <w:rFonts w:ascii="Wingdings" w:hAnsi="Wingdings" w:hint="default"/>
+      </w:rPr>
+    </w:lvl>
+  </w:abstractNum>
+  <w:abstractNum w:abstractNumId="10" w15:restartNumberingAfterBreak="0">
+    <w:nsid w:val="5BE51C68"/>
+    <w:multiLevelType w:val="hybridMultilevel"/>
+    <w:tmpl w:val="BCB855C2"/>
+    <w:lvl w:ilvl="0" w:tplc="04090001">
+      <w:start w:val="1"/>
+      <w:numFmt w:val="bullet"/>
+      <w:lvlText w:val=""/>
+      <w:lvlJc w:val="left"/>
+      <w:pPr>
+        <w:ind w:left="720" w:hanging="360"/>
+      </w:pPr>
+      <w:rPr>
+        <w:rFonts w:ascii="Symbol" w:hAnsi="Symbol" w:hint="default"/>
+      </w:rPr>
+    </w:lvl>
+    <w:lvl w:ilvl="1" w:tplc="04090003" w:tentative="1">
+      <w:start w:val="1"/>
+      <w:numFmt w:val="bullet"/>
+      <w:lvlText w:val="o"/>
+      <w:lvlJc w:val="left"/>
+      <w:pPr>
+        <w:ind w:left="1440" w:hanging="360"/>
+      </w:pPr>
+      <w:rPr>
+        <w:rFonts w:ascii="Courier New" w:hAnsi="Courier New" w:cs="Courier New" w:hint="default"/>
+      </w:rPr>
+    </w:lvl>
+    <w:lvl w:ilvl="2" w:tplc="04090005" w:tentative="1">
+      <w:start w:val="1"/>
+      <w:numFmt w:val="bullet"/>
+      <w:lvlText w:val=""/>
+      <w:lvlJc w:val="left"/>
+      <w:pPr>
+        <w:ind w:left="2160" w:hanging="360"/>
+      </w:pPr>
+      <w:rPr>
+        <w:rFonts w:ascii="Wingdings" w:hAnsi="Wingdings" w:hint="default"/>
+      </w:rPr>
+    </w:lvl>
+    <w:lvl w:ilvl="3" w:tplc="04090001" w:tentative="1">
+      <w:start w:val="1"/>
+      <w:numFmt w:val="bullet"/>
+      <w:lvlText w:val=""/>
+      <w:lvlJc w:val="left"/>
+      <w:pPr>
+        <w:ind w:left="2880" w:hanging="360"/>
+      </w:pPr>
+      <w:rPr>
+        <w:rFonts w:ascii="Symbol" w:hAnsi="Symbol" w:hint="default"/>
+      </w:rPr>
+    </w:lvl>
+    <w:lvl w:ilvl="4" w:tplc="04090003" w:tentative="1">
+      <w:start w:val="1"/>
+      <w:numFmt w:val="bullet"/>
+      <w:lvlText w:val="o"/>
+      <w:lvlJc w:val="left"/>
+      <w:pPr>
+        <w:ind w:left="3600" w:hanging="360"/>
+      </w:pPr>
+      <w:rPr>
+        <w:rFonts w:ascii="Courier New" w:hAnsi="Courier New" w:cs="Courier New" w:hint="default"/>
+      </w:rPr>
+    </w:lvl>
+    <w:lvl w:ilvl="5" w:tplc="04090005" w:tentative="1">
+      <w:start w:val="1"/>
+      <w:numFmt w:val="bullet"/>
+      <w:lvlText w:val=""/>
+      <w:lvlJc w:val="left"/>
+      <w:pPr>
+        <w:ind w:left="4320" w:hanging="360"/>
+      </w:pPr>
+      <w:rPr>
+        <w:rFonts w:ascii="Wingdings" w:hAnsi="Wingdings" w:hint="default"/>
+      </w:rPr>
+    </w:lvl>
+    <w:lvl w:ilvl="6" w:tplc="04090001" w:tentative="1">
+      <w:start w:val="1"/>
+      <w:numFmt w:val="bullet"/>
+      <w:lvlText w:val=""/>
+      <w:lvlJc w:val="left"/>
+      <w:pPr>
+        <w:ind w:left="5040" w:hanging="360"/>
+      </w:pPr>
+      <w:rPr>
+        <w:rFonts w:ascii="Symbol" w:hAnsi="Symbol" w:hint="default"/>
+      </w:rPr>
+    </w:lvl>
+    <w:lvl w:ilvl="7" w:tplc="04090003" w:tentative="1">
+      <w:start w:val="1"/>
+      <w:numFmt w:val="bullet"/>
+      <w:lvlText w:val="o"/>
+      <w:lvlJc w:val="left"/>
+      <w:pPr>
+        <w:ind w:left="5760" w:hanging="360"/>
+      </w:pPr>
+      <w:rPr>
+        <w:rFonts w:ascii="Courier New" w:hAnsi="Courier New" w:cs="Courier New" w:hint="default"/>
+      </w:rPr>
+    </w:lvl>
+    <w:lvl w:ilvl="8" w:tplc="04090005" w:tentative="1">
+      <w:start w:val="1"/>
+      <w:numFmt w:val="bullet"/>
+      <w:lvlText w:val=""/>
+      <w:lvlJc w:val="left"/>
+      <w:pPr>
+        <w:ind w:left="6480" w:hanging="360"/>
+      </w:pPr>
+      <w:rPr>
+        <w:rFonts w:ascii="Wingdings" w:hAnsi="Wingdings" w:hint="default"/>
+      </w:rPr>
+    </w:lvl>
+  </w:abstractNum>
+  <w:abstractNum w:abstractNumId="11" w15:restartNumberingAfterBreak="0">
     <w:nsid w:val="743E4B0D"/>
     <w:multiLevelType w:val="hybridMultilevel"/>
     <w:tmpl w:val="CA4EB5F8"/>
@@ -1518,6 +2579,12 @@
     <w:abstractNumId w:val="0"/>
   </w:num>
   <w:num w:numId="10">
+    <w:abstractNumId w:val="11"/>
+  </w:num>
+  <w:num w:numId="11">
+    <w:abstractNumId w:val="10"/>
+  </w:num>
+  <w:num w:numId="12">
     <w:abstractNumId w:val="9"/>
   </w:num>
 </w:numbering>
@@ -13249,7 +14316,7 @@
 </file>
 
 <file path=customXml/itemProps1.xml><?xml version="1.0" encoding="utf-8"?>
-<ds:datastoreItem xmlns:ds="http://schemas.openxmlformats.org/officeDocument/2006/customXml" ds:itemID="{13C28038-5ABB-4796-B7B7-AD12371154E5}">
+<ds:datastoreItem xmlns:ds="http://schemas.openxmlformats.org/officeDocument/2006/customXml" ds:itemID="{AA52D5F5-2D65-4359-A475-A577C97DF789}">
   <ds:schemaRefs>
     <ds:schemaRef ds:uri="http://schemas.openxmlformats.org/officeDocument/2006/bibliography"/>
   </ds:schemaRefs>

</xml_diff>